<commit_message>
Fix .bas, update quote parsing
</commit_message>
<xml_diff>
--- a/Documentation/MacBasic-Users-Guide.docx
+++ b/Documentation/MacBasic-Users-Guide.docx
@@ -518,6 +518,9 @@
           <w:sz w:val="21"/>
         </w:rPr>
         <w:t>Examples use UTF-8 source files with the .bas filename extension. Screen coordinates use points. Canvas coordinates begin at the top-left of the view.</w:t>
+      </w:r>
+      <w:r>
+        <w:t xml:space="preserve"> String literals must be delimited by the straight ASCII double quote character (", U+0022). Curly typographic quotation marks are not string delimiters.</w:t>
       </w:r>
     </w:p>
     <w:p>
@@ -16314,6 +16317,8 @@
       </w:pPr>
       <w:r>
         <w:t>' MacBasic drawing example</w:t>
+        <w:br/>
+        <w:t>' String literals use the straight ASCII U+0022 delimiter only.</w:t>
         <w:br/>
         <w:t>WINDOW OPEN 1, "Drawing Demo", 640, 420, 160, 140</w:t>
         <w:br/>

</xml_diff>

<commit_message>
update support for the compiler
</commit_message>
<xml_diff>
--- a/Documentation/MacBasic-Users-Guide.docx
+++ b/Documentation/MacBasic-Users-Guide.docx
@@ -1936,6 +1936,30 @@
           <w:sz w:val="21"/>
         </w:rPr>
         <w:t>When a source path is passed on the command line, MacBasic runs without opening the editor. PRINT writes to standard output. Native windows and drawing views are ignored with a diagnostic, and BEEP writes the terminal bell.</w:t>
+      </w:r>
+    </w:p>
+    <w:p>
+      <w:pPr>
+        <w:pStyle w:val="Heading2"/>
+      </w:pPr>
+      <w:r>
+        <w:t>Compiling a Program</w:t>
+      </w:r>
+    </w:p>
+    <w:p>
+      <w:pPr/>
+      <w:r>
+        <w:t>Choose File &gt; Compile or use the Compile button to package the current document as a standalone executable. Select an output name in the save panel. The executable contains the MacBasic runtime and an embedded copy of the source, so the original .bas file is not needed at run time. Compiled programs start the native AppKit or GNUstep host and support WINDOW, VIEW, drawing, sound, and input like the IDE. Build the executable on the operating system where it will run. The optional --console argument selects headless execution, in which native window operations are ignored.</w:t>
+      </w:r>
+    </w:p>
+    <w:p>
+      <w:pPr>
+        <w:pStyle w:val="Syntax"/>
+      </w:pPr>
+      <w:r>
+        <w:t>./build/MacBasic --compile program.bas program</w:t>
+        <w:br/>
+        <w:t>./program</w:t>
       </w:r>
     </w:p>
     <w:p>

</xml_diff>

<commit_message>
Make it possible for the user to specify a tool or an app, also select an icon
</commit_message>
<xml_diff>
--- a/Documentation/MacBasic-Users-Guide.docx
+++ b/Documentation/MacBasic-Users-Guide.docx
@@ -1949,7 +1949,7 @@
     <w:p>
       <w:pPr/>
       <w:r>
-        <w:t>Choose File &gt; Compile or use the Compile button to package the current document as a standalone executable. Select an output name in the save panel. The executable contains the MacBasic runtime and an embedded copy of the source, so the original .bas file is not needed at run time. Compiled programs start the native AppKit or GNUstep host and support WINDOW, VIEW, drawing, sound, and input like the IDE. Build the executable on the operating system where it will run. The optional --console argument selects headless execution, in which native window operations are ignored.</w:t>
+        <w:t>Choose File &gt; Compile or use the Compile button, then select Application or Tool. An application is packaged as a native macOS app wrapper or GNUstep app wrapper and opens with the MacBasic window environment. A tool is a standalone terminal executable. When building an application, choose a custom icon or use the generic MacBasic icon. Custom macOS icons should be .icns files; GNUstep accepts .png, .tiff, or .icns files. Both targets contain the MacBasic runtime and an embedded copy of the source, so the original .bas file is not needed at run time. Build on the operating system where the result will run. The optional --console argument selects headless execution, in which native window operations are ignored.</w:t>
       </w:r>
     </w:p>
     <w:p>
@@ -1957,9 +1957,14 @@
         <w:pStyle w:val="Syntax"/>
       </w:pPr>
       <w:r>
-        <w:t>./build/MacBasic --compile program.bas program</w:t>
+        <w:t>./build/MacBasic --compile-tool program.bas program</w:t>
         <w:br/>
         <w:t>./program</w:t>
+        <w:br/>
+        <w:br/>
+        <w:t>./build/MacBasic --compile-app program.bas Program.app</w:t>
+        <w:br/>
+        <w:t>./build/MacBasic --compile-app program.bas Program.app MyProgram.icns</w:t>
       </w:r>
     </w:p>
     <w:p>

</xml_diff>